<commit_message>
feat:some basic python knowledge
</commit_message>
<xml_diff>
--- a/week01_python_numpy/day01/day01学习内容.docx
+++ b/week01_python_numpy/day01/day01学习内容.docx
@@ -119,25 +119,536 @@
           <w:rFonts w:hint="eastAsia"/>
         </w:rPr>
       </w:pPr>
+      <w:r>
+        <w:rPr>
+          <w:rFonts w:hint="eastAsia"/>
+        </w:rPr>
+        <w:t>创建虚拟环境；</w:t>
+      </w:r>
+    </w:p>
+    <w:p>
+      <w:pPr>
+        <w:rPr>
+          <w:rFonts w:hint="eastAsia"/>
+        </w:rPr>
+      </w:pPr>
+      <w:r>
+        <w:rPr>
+          <w:rFonts w:hint="eastAsia"/>
+        </w:rPr>
+        <w:t>激活虚拟环境；</w:t>
+      </w:r>
+    </w:p>
+    <w:p>
+      <w:pPr>
+        <w:rPr>
+          <w:rFonts w:hint="eastAsia"/>
+        </w:rPr>
+      </w:pPr>
+      <w:r>
+        <w:rPr>
+          <w:rFonts w:hint="eastAsia"/>
+        </w:rPr>
+        <w:t>安装 NumPy；</w:t>
+      </w:r>
+    </w:p>
+    <w:p>
+      <w:pPr>
+        <w:rPr>
+          <w:rFonts w:hint="eastAsia"/>
+        </w:rPr>
+      </w:pPr>
+      <w:r>
+        <w:rPr>
+          <w:rFonts w:hint="eastAsia"/>
+        </w:rPr>
+        <w:t>使用 pip 查看依赖；</w:t>
+      </w:r>
+    </w:p>
+    <w:p>
+      <w:pPr>
+        <w:rPr>
+          <w:rFonts w:hint="eastAsia"/>
+        </w:rPr>
+      </w:pPr>
+      <w:r>
+        <w:rPr>
+          <w:rFonts w:hint="eastAsia"/>
+        </w:rPr>
+        <w:t>创建 Git 仓库。</w:t>
+      </w:r>
+    </w:p>
+    <w:p>
+      <w:pPr>
+        <w:rPr>
+          <w:rFonts w:hint="eastAsia"/>
+        </w:rPr>
+      </w:pPr>
+    </w:p>
+    <w:p>
+      <w:pPr>
+        <w:rPr>
+          <w:rFonts w:hint="eastAsia"/>
+        </w:rPr>
+      </w:pPr>
+      <w:r>
+        <w:rPr>
+          <w:rFonts w:hint="eastAsia"/>
+        </w:rPr>
+        <w:t>建议项目结构：</w:t>
+      </w:r>
+    </w:p>
+    <w:p>
+      <w:pPr>
+        <w:rPr>
+          <w:rFonts w:hint="eastAsia"/>
+        </w:rPr>
+      </w:pPr>
+      <w:r>
+        <w:rPr>
+          <w:rFonts w:hint="eastAsia"/>
+        </w:rPr>
+        <w:t>embodied-ai-study/</w:t>
+      </w:r>
+    </w:p>
+    <w:p>
+      <w:pPr>
+        <w:rPr>
+          <w:rFonts w:hint="eastAsia"/>
+        </w:rPr>
+      </w:pPr>
+      <w:r>
+        <w:rPr>
+          <w:rFonts w:hint="eastAsia"/>
+        </w:rPr>
+        <w:t>└── week01_python_numpy/</w:t>
+      </w:r>
+    </w:p>
+    <w:p>
+      <w:pPr>
+        <w:rPr>
+          <w:rFonts w:hint="eastAsia"/>
+        </w:rPr>
+      </w:pPr>
+      <w:r>
+        <w:rPr>
+          <w:rFonts w:hint="eastAsia"/>
+        </w:rPr>
+        <w:t>├── day01/</w:t>
+      </w:r>
+    </w:p>
+    <w:p>
+      <w:pPr>
+        <w:rPr>
+          <w:rFonts w:hint="eastAsia"/>
+        </w:rPr>
+      </w:pPr>
+      <w:r>
+        <w:rPr>
+          <w:rFonts w:hint="eastAsia"/>
+        </w:rPr>
+        <w:t>├── day02/</w:t>
+      </w:r>
+    </w:p>
+    <w:p>
+      <w:pPr>
+        <w:rPr>
+          <w:rFonts w:hint="eastAsia"/>
+        </w:rPr>
+      </w:pPr>
+      <w:r>
+        <w:rPr>
+          <w:rFonts w:hint="eastAsia"/>
+        </w:rPr>
+        <w:t>├── day03/</w:t>
+      </w:r>
+    </w:p>
+    <w:p>
+      <w:pPr>
+        <w:rPr>
+          <w:rFonts w:hint="eastAsia"/>
+        </w:rPr>
+      </w:pPr>
+      <w:r>
+        <w:rPr>
+          <w:rFonts w:hint="eastAsia"/>
+        </w:rPr>
+        <w:t>├── day04/</w:t>
+      </w:r>
+    </w:p>
+    <w:p>
+      <w:pPr>
+        <w:rPr>
+          <w:rFonts w:hint="eastAsia"/>
+        </w:rPr>
+      </w:pPr>
+      <w:r>
+        <w:rPr>
+          <w:rFonts w:hint="eastAsia"/>
+        </w:rPr>
+        <w:t>├── day05/</w:t>
+      </w:r>
+    </w:p>
+    <w:p>
+      <w:pPr>
+        <w:rPr>
+          <w:rFonts w:hint="eastAsia"/>
+        </w:rPr>
+      </w:pPr>
+      <w:r>
+        <w:rPr>
+          <w:rFonts w:hint="eastAsia"/>
+        </w:rPr>
+        <w:t>├── project/</w:t>
+      </w:r>
+    </w:p>
+    <w:p>
+      <w:pPr>
+        <w:rPr>
+          <w:rFonts w:hint="eastAsia"/>
+        </w:rPr>
+      </w:pPr>
+      <w:r>
+        <w:rPr>
+          <w:rFonts w:hint="eastAsia"/>
+        </w:rPr>
+        <w:t>├── README.md</w:t>
+      </w:r>
+    </w:p>
+    <w:p>
+      <w:pPr>
+        <w:rPr>
+          <w:rFonts w:hint="eastAsia"/>
+        </w:rPr>
+      </w:pPr>
+      <w:r>
+        <w:rPr>
+          <w:rFonts w:hint="eastAsia"/>
+        </w:rPr>
+        <w:t>├── requirements.txt</w:t>
+      </w:r>
+    </w:p>
+    <w:p>
+      <w:pPr>
+        <w:rPr>
+          <w:rFonts w:hint="eastAsia"/>
+        </w:rPr>
+      </w:pPr>
+      <w:r>
+        <w:rPr>
+          <w:rFonts w:hint="eastAsia"/>
+        </w:rPr>
+        <w:t>└── .gitignore</w:t>
+      </w:r>
+    </w:p>
+    <w:p>
+      <w:pPr>
+        <w:rPr>
+          <w:rFonts w:hint="eastAsia"/>
+        </w:rPr>
+      </w:pPr>
+    </w:p>
+    <w:p>
+      <w:pPr>
+        <w:rPr>
+          <w:rFonts w:hint="eastAsia"/>
+        </w:rPr>
+      </w:pPr>
+      <w:r>
+        <w:rPr>
+          <w:rFonts w:hint="eastAsia"/>
+        </w:rPr>
+        <w:t>至少掌握以下命令的含义：</w:t>
+      </w:r>
+    </w:p>
+    <w:p>
+      <w:pPr>
+        <w:rPr>
+          <w:rFonts w:hint="eastAsia"/>
+        </w:rPr>
+      </w:pPr>
+    </w:p>
+    <w:p>
+      <w:pPr>
+        <w:rPr>
+          <w:rFonts w:hint="eastAsia"/>
+        </w:rPr>
+      </w:pPr>
+      <w:r>
+        <w:rPr>
+          <w:rFonts w:hint="eastAsia"/>
+        </w:rPr>
+        <w:t>bashpython --version</w:t>
+      </w:r>
+    </w:p>
+    <w:p>
+      <w:pPr>
+        <w:rPr>
+          <w:rFonts w:hint="default" w:eastAsiaTheme="minorEastAsia"/>
+          <w:lang w:val="en-US" w:eastAsia="zh-CN"/>
+        </w:rPr>
+      </w:pPr>
+      <w:r>
+        <w:rPr>
+          <w:rFonts w:hint="eastAsia"/>
+        </w:rPr>
+        <w:t>python -m venv .venv</w:t>
+      </w:r>
+      <w:r>
+        <w:rPr>
+          <w:rFonts w:hint="eastAsia"/>
+          <w:lang w:val="en-US" w:eastAsia="zh-CN"/>
+        </w:rPr>
+        <w:t xml:space="preserve">  </w:t>
+      </w:r>
+    </w:p>
+    <w:p>
+      <w:pPr>
+        <w:rPr>
+          <w:rFonts w:hint="eastAsia"/>
+        </w:rPr>
+      </w:pPr>
+      <w:r>
+        <w:rPr>
+          <w:rFonts w:hint="eastAsia"/>
+        </w:rPr>
+        <w:t>pip install numpy</w:t>
+      </w:r>
+    </w:p>
+    <w:p>
+      <w:pPr>
+        <w:rPr>
+          <w:rFonts w:hint="eastAsia"/>
+        </w:rPr>
+      </w:pPr>
+      <w:r>
+        <w:rPr>
+          <w:rFonts w:hint="eastAsia"/>
+        </w:rPr>
+        <w:t>pip list</w:t>
+      </w:r>
+    </w:p>
+    <w:p>
+      <w:pPr>
+        <w:rPr>
+          <w:rFonts w:hint="eastAsia"/>
+        </w:rPr>
+      </w:pPr>
+      <w:r>
+        <w:rPr>
+          <w:rFonts w:hint="eastAsia"/>
+        </w:rPr>
+        <w:t>pip freeze</w:t>
+      </w:r>
+    </w:p>
+    <w:p>
+      <w:pPr>
+        <w:rPr>
+          <w:rFonts w:hint="eastAsia"/>
+        </w:rPr>
+      </w:pPr>
+      <w:r>
+        <w:rPr>
+          <w:rFonts w:hint="eastAsia"/>
+        </w:rPr>
+        <w:t>git init</w:t>
+      </w:r>
+    </w:p>
+    <w:p>
+      <w:pPr>
+        <w:rPr>
+          <w:rFonts w:hint="eastAsia"/>
+        </w:rPr>
+      </w:pPr>
+      <w:r>
+        <w:rPr>
+          <w:rFonts w:hint="eastAsia"/>
+        </w:rPr>
+        <w:t>git status</w:t>
+      </w:r>
+    </w:p>
+    <w:p>
+      <w:pPr>
+        <w:rPr>
+          <w:rFonts w:hint="eastAsia"/>
+        </w:rPr>
+      </w:pPr>
+      <w:r>
+        <w:rPr>
+          <w:rFonts w:hint="eastAsia"/>
+        </w:rPr>
+        <w:t>git add .</w:t>
+      </w:r>
+    </w:p>
+    <w:p>
+      <w:pPr>
+        <w:rPr>
+          <w:rFonts w:hint="eastAsia"/>
+        </w:rPr>
+      </w:pPr>
+      <w:r>
+        <w:rPr>
+          <w:rFonts w:hint="eastAsia"/>
+        </w:rPr>
+        <w:t>git commit</w:t>
+      </w:r>
+    </w:p>
+    <w:p>
+      <w:pPr>
+        <w:rPr>
+          <w:rFonts w:hint="eastAsia"/>
+        </w:rPr>
+      </w:pPr>
+      <w:r>
+        <w:rPr>
+          <w:rFonts w:hint="eastAsia"/>
+        </w:rPr>
+        <w:t>你不需要死记所有参数，但必须知道每条命令解决什么问题。</w:t>
+      </w:r>
+    </w:p>
+    <w:p>
+      <w:pPr>
+        <w:rPr>
+          <w:rFonts w:hint="eastAsia"/>
+        </w:rPr>
+      </w:pPr>
+    </w:p>
+    <w:p>
+      <w:pPr>
+        <w:rPr>
+          <w:rFonts w:hint="eastAsia"/>
+        </w:rPr>
+      </w:pPr>
       <w:bookmarkStart w:id="0" w:name="_GoBack"/>
       <w:r>
         <w:rPr>
           <w:rFonts w:hint="eastAsia"/>
         </w:rPr>
-        <w:t>创建虚拟环境；</w:t>
-      </w:r>
-    </w:p>
-    <w:p>
-      <w:pPr>
-        <w:rPr>
-          <w:rFonts w:hint="eastAsia"/>
-        </w:rPr>
-      </w:pPr>
-      <w:r>
-        <w:rPr>
-          <w:rFonts w:hint="eastAsia"/>
-        </w:rPr>
-        <w:t>激活虚拟环境；</w:t>
+        <w:t>第 2 部分：Python 基础诊断，约 50 分钟</w:t>
+      </w:r>
+    </w:p>
+    <w:p>
+      <w:pPr>
+        <w:rPr>
+          <w:rFonts w:hint="eastAsia"/>
+        </w:rPr>
+      </w:pPr>
+      <w:r>
+        <w:rPr>
+          <w:rFonts w:hint="eastAsia"/>
+        </w:rPr>
+        <w:t>复习并练习：</w:t>
+      </w:r>
+    </w:p>
+    <w:p>
+      <w:pPr>
+        <w:rPr>
+          <w:rFonts w:hint="eastAsia"/>
+        </w:rPr>
+      </w:pPr>
+    </w:p>
+    <w:p>
+      <w:pPr>
+        <w:rPr>
+          <w:rFonts w:hint="eastAsia"/>
+        </w:rPr>
+      </w:pPr>
+      <w:r>
+        <w:rPr>
+          <w:rFonts w:hint="eastAsia"/>
+        </w:rPr>
+        <w:t>int、float、bool、str；</w:t>
+      </w:r>
+    </w:p>
+    <w:p>
+      <w:pPr>
+        <w:rPr>
+          <w:rFonts w:hint="eastAsia"/>
+        </w:rPr>
+      </w:pPr>
+      <w:r>
+        <w:rPr>
+          <w:rFonts w:hint="eastAsia"/>
+        </w:rPr>
+        <w:t>变量赋值；</w:t>
+      </w:r>
+    </w:p>
+    <w:p>
+      <w:pPr>
+        <w:rPr>
+          <w:rFonts w:hint="eastAsia"/>
+        </w:rPr>
+      </w:pPr>
+      <w:r>
+        <w:rPr>
+          <w:rFonts w:hint="eastAsia"/>
+        </w:rPr>
+        <w:t>算术运算；</w:t>
+      </w:r>
+    </w:p>
+    <w:p>
+      <w:pPr>
+        <w:rPr>
+          <w:rFonts w:hint="eastAsia"/>
+        </w:rPr>
+      </w:pPr>
+      <w:r>
+        <w:rPr>
+          <w:rFonts w:hint="eastAsia"/>
+        </w:rPr>
+        <w:t>比较运算；</w:t>
+      </w:r>
+    </w:p>
+    <w:p>
+      <w:pPr>
+        <w:rPr>
+          <w:rFonts w:hint="eastAsia"/>
+        </w:rPr>
+      </w:pPr>
+      <w:r>
+        <w:rPr>
+          <w:rFonts w:hint="eastAsia"/>
+        </w:rPr>
+        <w:t>if 判断；</w:t>
+      </w:r>
+    </w:p>
+    <w:p>
+      <w:pPr>
+        <w:rPr>
+          <w:rFonts w:hint="eastAsia"/>
+        </w:rPr>
+      </w:pPr>
+      <w:r>
+        <w:rPr>
+          <w:rFonts w:hint="eastAsia"/>
+        </w:rPr>
+        <w:t>for 和 while 循环；</w:t>
+      </w:r>
+    </w:p>
+    <w:p>
+      <w:pPr>
+        <w:rPr>
+          <w:rFonts w:hint="eastAsia"/>
+        </w:rPr>
+      </w:pPr>
+      <w:r>
+        <w:rPr>
+          <w:rFonts w:hint="eastAsia"/>
+        </w:rPr>
+        <w:t>input() 和 print()；</w:t>
+      </w:r>
+    </w:p>
+    <w:p>
+      <w:pPr>
+        <w:rPr>
+          <w:rFonts w:hint="eastAsia"/>
+        </w:rPr>
+      </w:pPr>
+      <w:r>
+        <w:rPr>
+          <w:rFonts w:hint="eastAsia"/>
+        </w:rPr>
+        <w:t>f-string。</w:t>
       </w:r>
     </w:p>
     <w:bookmarkEnd w:id="0"/>
@@ -147,509 +658,6 @@
           <w:rFonts w:hint="eastAsia"/>
         </w:rPr>
       </w:pPr>
-      <w:r>
-        <w:rPr>
-          <w:rFonts w:hint="eastAsia"/>
-        </w:rPr>
-        <w:t>安装 NumPy；</w:t>
-      </w:r>
-    </w:p>
-    <w:p>
-      <w:pPr>
-        <w:rPr>
-          <w:rFonts w:hint="eastAsia"/>
-        </w:rPr>
-      </w:pPr>
-      <w:r>
-        <w:rPr>
-          <w:rFonts w:hint="eastAsia"/>
-        </w:rPr>
-        <w:t>使用 pip 查看依赖；</w:t>
-      </w:r>
-    </w:p>
-    <w:p>
-      <w:pPr>
-        <w:rPr>
-          <w:rFonts w:hint="eastAsia"/>
-        </w:rPr>
-      </w:pPr>
-      <w:r>
-        <w:rPr>
-          <w:rFonts w:hint="eastAsia"/>
-        </w:rPr>
-        <w:t>创建 Git 仓库。</w:t>
-      </w:r>
-    </w:p>
-    <w:p>
-      <w:pPr>
-        <w:rPr>
-          <w:rFonts w:hint="eastAsia"/>
-        </w:rPr>
-      </w:pPr>
-    </w:p>
-    <w:p>
-      <w:pPr>
-        <w:rPr>
-          <w:rFonts w:hint="eastAsia"/>
-        </w:rPr>
-      </w:pPr>
-      <w:r>
-        <w:rPr>
-          <w:rFonts w:hint="eastAsia"/>
-        </w:rPr>
-        <w:t>建议项目结构：</w:t>
-      </w:r>
-    </w:p>
-    <w:p>
-      <w:pPr>
-        <w:rPr>
-          <w:rFonts w:hint="eastAsia"/>
-        </w:rPr>
-      </w:pPr>
-      <w:r>
-        <w:rPr>
-          <w:rFonts w:hint="eastAsia"/>
-        </w:rPr>
-        <w:t>embodied-ai-study/</w:t>
-      </w:r>
-    </w:p>
-    <w:p>
-      <w:pPr>
-        <w:rPr>
-          <w:rFonts w:hint="eastAsia"/>
-        </w:rPr>
-      </w:pPr>
-      <w:r>
-        <w:rPr>
-          <w:rFonts w:hint="eastAsia"/>
-        </w:rPr>
-        <w:t>└── week01_python_numpy/</w:t>
-      </w:r>
-    </w:p>
-    <w:p>
-      <w:pPr>
-        <w:rPr>
-          <w:rFonts w:hint="eastAsia"/>
-        </w:rPr>
-      </w:pPr>
-      <w:r>
-        <w:rPr>
-          <w:rFonts w:hint="eastAsia"/>
-        </w:rPr>
-        <w:t>├── day01/</w:t>
-      </w:r>
-    </w:p>
-    <w:p>
-      <w:pPr>
-        <w:rPr>
-          <w:rFonts w:hint="eastAsia"/>
-        </w:rPr>
-      </w:pPr>
-      <w:r>
-        <w:rPr>
-          <w:rFonts w:hint="eastAsia"/>
-        </w:rPr>
-        <w:t>├── day02/</w:t>
-      </w:r>
-    </w:p>
-    <w:p>
-      <w:pPr>
-        <w:rPr>
-          <w:rFonts w:hint="eastAsia"/>
-        </w:rPr>
-      </w:pPr>
-      <w:r>
-        <w:rPr>
-          <w:rFonts w:hint="eastAsia"/>
-        </w:rPr>
-        <w:t>├── day03/</w:t>
-      </w:r>
-    </w:p>
-    <w:p>
-      <w:pPr>
-        <w:rPr>
-          <w:rFonts w:hint="eastAsia"/>
-        </w:rPr>
-      </w:pPr>
-      <w:r>
-        <w:rPr>
-          <w:rFonts w:hint="eastAsia"/>
-        </w:rPr>
-        <w:t>├── day04/</w:t>
-      </w:r>
-    </w:p>
-    <w:p>
-      <w:pPr>
-        <w:rPr>
-          <w:rFonts w:hint="eastAsia"/>
-        </w:rPr>
-      </w:pPr>
-      <w:r>
-        <w:rPr>
-          <w:rFonts w:hint="eastAsia"/>
-        </w:rPr>
-        <w:t>├── day05/</w:t>
-      </w:r>
-    </w:p>
-    <w:p>
-      <w:pPr>
-        <w:rPr>
-          <w:rFonts w:hint="eastAsia"/>
-        </w:rPr>
-      </w:pPr>
-      <w:r>
-        <w:rPr>
-          <w:rFonts w:hint="eastAsia"/>
-        </w:rPr>
-        <w:t>├── project/</w:t>
-      </w:r>
-    </w:p>
-    <w:p>
-      <w:pPr>
-        <w:rPr>
-          <w:rFonts w:hint="eastAsia"/>
-        </w:rPr>
-      </w:pPr>
-      <w:r>
-        <w:rPr>
-          <w:rFonts w:hint="eastAsia"/>
-        </w:rPr>
-        <w:t>├── README.md</w:t>
-      </w:r>
-    </w:p>
-    <w:p>
-      <w:pPr>
-        <w:rPr>
-          <w:rFonts w:hint="eastAsia"/>
-        </w:rPr>
-      </w:pPr>
-      <w:r>
-        <w:rPr>
-          <w:rFonts w:hint="eastAsia"/>
-        </w:rPr>
-        <w:t>├── requirements.txt</w:t>
-      </w:r>
-    </w:p>
-    <w:p>
-      <w:pPr>
-        <w:rPr>
-          <w:rFonts w:hint="eastAsia"/>
-        </w:rPr>
-      </w:pPr>
-      <w:r>
-        <w:rPr>
-          <w:rFonts w:hint="eastAsia"/>
-        </w:rPr>
-        <w:t>└── .gitignore</w:t>
-      </w:r>
-    </w:p>
-    <w:p>
-      <w:pPr>
-        <w:rPr>
-          <w:rFonts w:hint="eastAsia"/>
-        </w:rPr>
-      </w:pPr>
-    </w:p>
-    <w:p>
-      <w:pPr>
-        <w:rPr>
-          <w:rFonts w:hint="eastAsia"/>
-        </w:rPr>
-      </w:pPr>
-      <w:r>
-        <w:rPr>
-          <w:rFonts w:hint="eastAsia"/>
-        </w:rPr>
-        <w:t>至少掌握以下命令的含义：</w:t>
-      </w:r>
-    </w:p>
-    <w:p>
-      <w:pPr>
-        <w:rPr>
-          <w:rFonts w:hint="eastAsia"/>
-        </w:rPr>
-      </w:pPr>
-    </w:p>
-    <w:p>
-      <w:pPr>
-        <w:rPr>
-          <w:rFonts w:hint="eastAsia"/>
-        </w:rPr>
-      </w:pPr>
-      <w:r>
-        <w:rPr>
-          <w:rFonts w:hint="eastAsia"/>
-        </w:rPr>
-        <w:t>bashpython --version</w:t>
-      </w:r>
-    </w:p>
-    <w:p>
-      <w:pPr>
-        <w:rPr>
-          <w:rFonts w:hint="eastAsia"/>
-        </w:rPr>
-      </w:pPr>
-      <w:r>
-        <w:rPr>
-          <w:rFonts w:hint="eastAsia"/>
-        </w:rPr>
-        <w:t>python -m venv .venv</w:t>
-      </w:r>
-    </w:p>
-    <w:p>
-      <w:pPr>
-        <w:rPr>
-          <w:rFonts w:hint="eastAsia"/>
-        </w:rPr>
-      </w:pPr>
-      <w:r>
-        <w:rPr>
-          <w:rFonts w:hint="eastAsia"/>
-        </w:rPr>
-        <w:t>pip install numpy</w:t>
-      </w:r>
-    </w:p>
-    <w:p>
-      <w:pPr>
-        <w:rPr>
-          <w:rFonts w:hint="eastAsia"/>
-        </w:rPr>
-      </w:pPr>
-      <w:r>
-        <w:rPr>
-          <w:rFonts w:hint="eastAsia"/>
-        </w:rPr>
-        <w:t>pip list</w:t>
-      </w:r>
-    </w:p>
-    <w:p>
-      <w:pPr>
-        <w:rPr>
-          <w:rFonts w:hint="eastAsia"/>
-        </w:rPr>
-      </w:pPr>
-      <w:r>
-        <w:rPr>
-          <w:rFonts w:hint="eastAsia"/>
-        </w:rPr>
-        <w:t>pip freeze</w:t>
-      </w:r>
-    </w:p>
-    <w:p>
-      <w:pPr>
-        <w:rPr>
-          <w:rFonts w:hint="eastAsia"/>
-        </w:rPr>
-      </w:pPr>
-      <w:r>
-        <w:rPr>
-          <w:rFonts w:hint="eastAsia"/>
-        </w:rPr>
-        <w:t>git init</w:t>
-      </w:r>
-    </w:p>
-    <w:p>
-      <w:pPr>
-        <w:rPr>
-          <w:rFonts w:hint="eastAsia"/>
-        </w:rPr>
-      </w:pPr>
-      <w:r>
-        <w:rPr>
-          <w:rFonts w:hint="eastAsia"/>
-        </w:rPr>
-        <w:t>git status</w:t>
-      </w:r>
-    </w:p>
-    <w:p>
-      <w:pPr>
-        <w:rPr>
-          <w:rFonts w:hint="eastAsia"/>
-        </w:rPr>
-      </w:pPr>
-      <w:r>
-        <w:rPr>
-          <w:rFonts w:hint="eastAsia"/>
-        </w:rPr>
-        <w:t>git add .</w:t>
-      </w:r>
-    </w:p>
-    <w:p>
-      <w:pPr>
-        <w:rPr>
-          <w:rFonts w:hint="eastAsia"/>
-        </w:rPr>
-      </w:pPr>
-      <w:r>
-        <w:rPr>
-          <w:rFonts w:hint="eastAsia"/>
-        </w:rPr>
-        <w:t>git commit</w:t>
-      </w:r>
-    </w:p>
-    <w:p>
-      <w:pPr>
-        <w:rPr>
-          <w:rFonts w:hint="eastAsia"/>
-        </w:rPr>
-      </w:pPr>
-      <w:r>
-        <w:rPr>
-          <w:rFonts w:hint="eastAsia"/>
-        </w:rPr>
-        <w:t>你不需要死记所有参数，但必须知道每条命令解决什么问题。</w:t>
-      </w:r>
-    </w:p>
-    <w:p>
-      <w:pPr>
-        <w:rPr>
-          <w:rFonts w:hint="eastAsia"/>
-        </w:rPr>
-      </w:pPr>
-    </w:p>
-    <w:p>
-      <w:pPr>
-        <w:rPr>
-          <w:rFonts w:hint="eastAsia"/>
-        </w:rPr>
-      </w:pPr>
-      <w:r>
-        <w:rPr>
-          <w:rFonts w:hint="eastAsia"/>
-        </w:rPr>
-        <w:t>第 2 部分：Python 基础诊断，约 50 分钟</w:t>
-      </w:r>
-    </w:p>
-    <w:p>
-      <w:pPr>
-        <w:rPr>
-          <w:rFonts w:hint="eastAsia"/>
-        </w:rPr>
-      </w:pPr>
-      <w:r>
-        <w:rPr>
-          <w:rFonts w:hint="eastAsia"/>
-        </w:rPr>
-        <w:t>复习并练习：</w:t>
-      </w:r>
-    </w:p>
-    <w:p>
-      <w:pPr>
-        <w:rPr>
-          <w:rFonts w:hint="eastAsia"/>
-        </w:rPr>
-      </w:pPr>
-    </w:p>
-    <w:p>
-      <w:pPr>
-        <w:rPr>
-          <w:rFonts w:hint="eastAsia"/>
-        </w:rPr>
-      </w:pPr>
-      <w:r>
-        <w:rPr>
-          <w:rFonts w:hint="eastAsia"/>
-        </w:rPr>
-        <w:t>int、float、bool、str；</w:t>
-      </w:r>
-    </w:p>
-    <w:p>
-      <w:pPr>
-        <w:rPr>
-          <w:rFonts w:hint="eastAsia"/>
-        </w:rPr>
-      </w:pPr>
-      <w:r>
-        <w:rPr>
-          <w:rFonts w:hint="eastAsia"/>
-        </w:rPr>
-        <w:t>变量赋值；</w:t>
-      </w:r>
-    </w:p>
-    <w:p>
-      <w:pPr>
-        <w:rPr>
-          <w:rFonts w:hint="eastAsia"/>
-        </w:rPr>
-      </w:pPr>
-      <w:r>
-        <w:rPr>
-          <w:rFonts w:hint="eastAsia"/>
-        </w:rPr>
-        <w:t>算术运算；</w:t>
-      </w:r>
-    </w:p>
-    <w:p>
-      <w:pPr>
-        <w:rPr>
-          <w:rFonts w:hint="eastAsia"/>
-        </w:rPr>
-      </w:pPr>
-      <w:r>
-        <w:rPr>
-          <w:rFonts w:hint="eastAsia"/>
-        </w:rPr>
-        <w:t>比较运算；</w:t>
-      </w:r>
-    </w:p>
-    <w:p>
-      <w:pPr>
-        <w:rPr>
-          <w:rFonts w:hint="eastAsia"/>
-        </w:rPr>
-      </w:pPr>
-      <w:r>
-        <w:rPr>
-          <w:rFonts w:hint="eastAsia"/>
-        </w:rPr>
-        <w:t>if 判断；</w:t>
-      </w:r>
-    </w:p>
-    <w:p>
-      <w:pPr>
-        <w:rPr>
-          <w:rFonts w:hint="eastAsia"/>
-        </w:rPr>
-      </w:pPr>
-      <w:r>
-        <w:rPr>
-          <w:rFonts w:hint="eastAsia"/>
-        </w:rPr>
-        <w:t>for 和 while 循环；</w:t>
-      </w:r>
-    </w:p>
-    <w:p>
-      <w:pPr>
-        <w:rPr>
-          <w:rFonts w:hint="eastAsia"/>
-        </w:rPr>
-      </w:pPr>
-      <w:r>
-        <w:rPr>
-          <w:rFonts w:hint="eastAsia"/>
-        </w:rPr>
-        <w:t>input() 和 print()；</w:t>
-      </w:r>
-    </w:p>
-    <w:p>
-      <w:pPr>
-        <w:rPr>
-          <w:rFonts w:hint="eastAsia"/>
-        </w:rPr>
-      </w:pPr>
-      <w:r>
-        <w:rPr>
-          <w:rFonts w:hint="eastAsia"/>
-        </w:rPr>
-        <w:t>f-string。</w:t>
-      </w:r>
-    </w:p>
-    <w:p>
-      <w:pPr>
-        <w:rPr>
-          <w:rFonts w:hint="eastAsia"/>
-        </w:rPr>
-      </w:pPr>
     </w:p>
     <w:p>
       <w:pPr>
@@ -782,6 +790,20 @@
         </w:rPr>
         <w:t>电量温度预期结果8040正常运行1540电量过低8085温度过高1090同时存在两项异常</w:t>
       </w:r>
+    </w:p>
+    <w:p>
+      <w:pPr>
+        <w:rPr>
+          <w:rFonts w:hint="eastAsia"/>
+        </w:rPr>
+      </w:pPr>
+    </w:p>
+    <w:p>
+      <w:pPr>
+        <w:rPr>
+          <w:rFonts w:hint="eastAsia"/>
+        </w:rPr>
+      </w:pPr>
     </w:p>
     <w:p>
       <w:pPr>

</xml_diff>